<commit_message>
feat: ICT Silver Bullet strategy (session-gated FVG + structure)
Second strategy on the shared strategies infrastructure, proving the
registry's extensibility. Session-gated to London/NY windows, FVG entry
aligned with HTF bias, structure-based SL (nearest protective swing,
FVG-boundary fallback) and nearest structure-liquidity target with 2 TPs
(50%/100%), min 1:2 RR. Deliberately uses the session + structure_levels
snapshot fields that scalping_3tp ignores.

- backend/app/strategies/ict_silver_bullet/ (new module)
- registered in strategies/service.py registry
- 19 new tests (test_strategy_ict_silver_bullet.py)
- generalised 2 api tests that assumed a single-strategy registry
- no new endpoints or shared-model changes
- auron_integration_readiness_vNNN chain untouched

Full suite: 4335 passed, 0 failed (4316 + 19 new).
</commit_message>
<xml_diff>
--- a/JARVIS_MASTER_PLAN.docx
+++ b/JARVIS_MASTER_PLAN.docx
@@ -2192,6 +2192,109 @@
           <w:bCs/>
           <w:b/>
         </w:rPr>
+        <w:t xml:space="preserve">Second strategy</w:t>
+      </w:r>
+      <w:r>
+        <w:rPr>
+          <w:bCs/>
+          <w:b/>
+        </w:rPr>
+        <w:t xml:space="preserve"> </w:t>
+      </w:r>
+      <w:r>
+        <w:rPr>
+          <w:rStyle w:val="VerbatimChar"/>
+          <w:bCs/>
+          <w:b/>
+        </w:rPr>
+        <w:t xml:space="preserve">ict_silver_bullet</w:t>
+      </w:r>
+      <w:r>
+        <w:t xml:space="preserve"> </w:t>
+      </w:r>
+      <w:r>
+        <w:t xml:space="preserve">(added 2026-08-31,</w:t>
+      </w:r>
+      <w:r>
+        <w:t xml:space="preserve"> </w:t>
+      </w:r>
+      <w:r>
+        <w:rPr>
+          <w:rStyle w:val="VerbatimChar"/>
+        </w:rPr>
+        <w:t xml:space="preserve">backend/app/strategies/ict_silver_bullet/</w:t>
+      </w:r>
+      <w:r>
+        <w:t xml:space="preserve">): session-gated to London/NY windows, FVG entry aligned with HTF bias, structure-based SL (nearest protective swing, FVG-boundary fallback) and nearest structure-liquidity target with 2 TPs (50%/100%), min 1:2 RR — deliberately uses the</w:t>
+      </w:r>
+      <w:r>
+        <w:t xml:space="preserve"> </w:t>
+      </w:r>
+      <w:r>
+        <w:rPr>
+          <w:rStyle w:val="VerbatimChar"/>
+        </w:rPr>
+        <w:t xml:space="preserve">session</w:t>
+      </w:r>
+      <w:r>
+        <w:t xml:space="preserve"> </w:t>
+      </w:r>
+      <w:r>
+        <w:t xml:space="preserve">+</w:t>
+      </w:r>
+      <w:r>
+        <w:t xml:space="preserve"> </w:t>
+      </w:r>
+      <w:r>
+        <w:rPr>
+          <w:rStyle w:val="VerbatimChar"/>
+        </w:rPr>
+        <w:t xml:space="preserve">structure_levels</w:t>
+      </w:r>
+      <w:r>
+        <w:t xml:space="preserve"> </w:t>
+      </w:r>
+      <w:r>
+        <w:t xml:space="preserve">snapshot fields</w:t>
+      </w:r>
+      <w:r>
+        <w:t xml:space="preserve"> </w:t>
+      </w:r>
+      <w:r>
+        <w:rPr>
+          <w:rStyle w:val="VerbatimChar"/>
+        </w:rPr>
+        <w:t xml:space="preserve">scalping_3tp</w:t>
+      </w:r>
+      <w:r>
+        <w:t xml:space="preserve"> </w:t>
+      </w:r>
+      <w:r>
+        <w:t xml:space="preserve">ignores, covered by</w:t>
+      </w:r>
+      <w:r>
+        <w:t xml:space="preserve"> </w:t>
+      </w:r>
+      <w:r>
+        <w:rPr>
+          <w:rStyle w:val="VerbatimChar"/>
+        </w:rPr>
+        <w:t xml:space="preserve">backend/tests/test_strategy_ict_silver_bullet.py</w:t>
+      </w:r>
+      <w:r>
+        <w:t xml:space="preserve"> </w:t>
+      </w:r>
+      <w:r>
+        <w:t xml:space="preserve">(19 tests).</w:t>
+      </w:r>
+      <w:r>
+        <w:t xml:space="preserve"> </w:t>
+      </w:r>
+      <w:r>
+        <w:rPr>
+          <w:bCs/>
+          <w:b/>
+        </w:rPr>
         <w:t xml:space="preserve">Future strategies</w:t>
       </w:r>
       <w:r>
@@ -2199,18 +2302,6 @@
       </w:r>
       <w:r>
         <w:t xml:space="preserve">(</w:t>
-      </w:r>
-      <w:r>
-        <w:rPr>
-          <w:rStyle w:val="VerbatimChar"/>
-        </w:rPr>
-        <w:t xml:space="preserve">ict</w:t>
-      </w:r>
-      <w:r>
-        <w:t xml:space="preserve">,</w:t>
-      </w:r>
-      <w:r>
-        <w:t xml:space="preserve"> </w:t>
       </w:r>
       <w:r>
         <w:rPr>
@@ -3041,6 +3132,139 @@
         <w:pStyle w:val="Compact"/>
       </w:pPr>
       <w:r>
+        <w:rPr>
+          <w:bCs/>
+          <w:b/>
+        </w:rPr>
+        <w:t xml:space="preserve">ICT Silver Bullet strategy added to the registry (2026-08-31):</w:t>
+      </w:r>
+      <w:r>
+        <w:t xml:space="preserve"> </w:t>
+      </w:r>
+      <w:r>
+        <w:rPr>
+          <w:rStyle w:val="VerbatimChar"/>
+        </w:rPr>
+        <w:t xml:space="preserve">backend/app/strategies/ict_silver_bullet/</w:t>
+      </w:r>
+      <w:r>
+        <w:t xml:space="preserve"> </w:t>
+      </w:r>
+      <w:r>
+        <w:t xml:space="preserve">(branch</w:t>
+      </w:r>
+      <w:r>
+        <w:t xml:space="preserve"> </w:t>
+      </w:r>
+      <w:r>
+        <w:rPr>
+          <w:rStyle w:val="VerbatimChar"/>
+        </w:rPr>
+        <w:t xml:space="preserve">feat/strategy-ict-silver-bullet</w:t>
+      </w:r>
+      <w:r>
+        <w:t xml:space="preserve">) — the second strategy on the shared infrastructure, proving the registry’s extensibility. Deliberately exercises the</w:t>
+      </w:r>
+      <w:r>
+        <w:t xml:space="preserve"> </w:t>
+      </w:r>
+      <w:r>
+        <w:rPr>
+          <w:rStyle w:val="VerbatimChar"/>
+        </w:rPr>
+        <w:t xml:space="preserve">session</w:t>
+      </w:r>
+      <w:r>
+        <w:t xml:space="preserve"> </w:t>
+      </w:r>
+      <w:r>
+        <w:t xml:space="preserve">and</w:t>
+      </w:r>
+      <w:r>
+        <w:t xml:space="preserve"> </w:t>
+      </w:r>
+      <w:r>
+        <w:rPr>
+          <w:rStyle w:val="VerbatimChar"/>
+        </w:rPr>
+        <w:t xml:space="preserve">structure_levels</w:t>
+      </w:r>
+      <w:r>
+        <w:t xml:space="preserve"> </w:t>
+      </w:r>
+      <w:r>
+        <w:t xml:space="preserve">snapshot fields that</w:t>
+      </w:r>
+      <w:r>
+        <w:t xml:space="preserve"> </w:t>
+      </w:r>
+      <w:r>
+        <w:rPr>
+          <w:rStyle w:val="VerbatimChar"/>
+        </w:rPr>
+        <w:t xml:space="preserve">scalping_3tp</w:t>
+      </w:r>
+      <w:r>
+        <w:t xml:space="preserve"> </w:t>
+      </w:r>
+      <w:r>
+        <w:t xml:space="preserve">ignores: session-gated to the London/NY</w:t>
+      </w:r>
+      <w:r>
+        <w:t xml:space="preserve"> </w:t>
+      </w:r>
+      <w:r>
+        <w:t xml:space="preserve">“</w:t>
+      </w:r>
+      <w:r>
+        <w:t xml:space="preserve">Silver Bullet</w:t>
+      </w:r>
+      <w:r>
+        <w:t xml:space="preserve">”</w:t>
+      </w:r>
+      <w:r>
+        <w:t xml:space="preserve"> </w:t>
+      </w:r>
+      <w:r>
+        <w:t xml:space="preserve">windows only, takes entries into an unmitigated FVG aligned with HTF bias, places the SL beyond the nearest protective swing structure (falls back to the FVG boundary with a 0.05% buffer when no structure exists), and targets the nearest opposing structure level (liquidity) with 2 TPs (50% at 50% RR, remainder at full target), min 1:2 RR. Confidence heuristic: base 55% + 10%/RR point + 10% structure-alignment bonus. Registered in</w:t>
+      </w:r>
+      <w:r>
+        <w:t xml:space="preserve"> </w:t>
+      </w:r>
+      <w:r>
+        <w:rPr>
+          <w:rStyle w:val="VerbatimChar"/>
+        </w:rPr>
+        <w:t xml:space="preserve">strategies/service.py</w:t>
+      </w:r>
+      <w:r>
+        <w:t xml:space="preserve"> </w:t>
+      </w:r>
+      <w:r>
+        <w:t xml:space="preserve">alongside</w:t>
+      </w:r>
+      <w:r>
+        <w:t xml:space="preserve"> </w:t>
+      </w:r>
+      <w:r>
+        <w:rPr>
+          <w:rStyle w:val="VerbatimChar"/>
+        </w:rPr>
+        <w:t xml:space="preserve">scalping_3tp</w:t>
+      </w:r>
+      <w:r>
+        <w:t xml:space="preserve">; no new endpoints or shared-model changes needed. Full suite green: 4335 passed, 0 failed (4316 + 19 new; two pre-existing api tests that assumed a single-strategy registry were generalised to assert both strategies).</w:t>
+      </w:r>
+    </w:p>
+    <w:p>
+      <w:pPr>
+        <w:numPr>
+          <w:ilvl w:val="0"/>
+          <w:numId w:val="1003"/>
+        </w:numPr>
+        <w:pStyle w:val="Compact"/>
+      </w:pPr>
+      <w:r>
         <w:t xml:space="preserve">Next: add</w:t>
       </w:r>
       <w:r>
@@ -3050,22 +3274,13 @@
         <w:rPr>
           <w:rStyle w:val="VerbatimChar"/>
         </w:rPr>
-        <w:t xml:space="preserve">ict</w:t>
-      </w:r>
-      <w:r>
-        <w:t xml:space="preserve">,</w:t>
-      </w:r>
-      <w:r>
-        <w:t xml:space="preserve"> </w:t>
-      </w:r>
-      <w:r>
-        <w:rPr>
-          <w:rStyle w:val="VerbatimChar"/>
-        </w:rPr>
         <w:t xml:space="preserve">smc</w:t>
       </w:r>
       <w:r>
-        <w:t xml:space="preserve">,</w:t>
+        <w:t xml:space="preserve"> </w:t>
+      </w:r>
+      <w:r>
+        <w:t xml:space="preserve">and</w:t>
       </w:r>
       <w:r>
         <w:t xml:space="preserve"> </w:t>
@@ -3080,19 +3295,37 @@
         <w:t xml:space="preserve"> </w:t>
       </w:r>
       <w:r>
-        <w:t xml:space="preserve">strategies to the registry (same pattern as</w:t>
-      </w:r>
-      <w:r>
-        <w:t xml:space="preserve"> </w:t>
-      </w:r>
-      <w:r>
-        <w:rPr>
-          <w:rStyle w:val="VerbatimChar"/>
-        </w:rPr>
-        <w:t xml:space="preserve">scalping_3tp</w:t>
-      </w:r>
-      <w:r>
-        <w:t xml:space="preserve">), then in a later gated PR wire strategy assignments + account compliance + the existing approval-gated MT5 executor to enable the full trade flow (strategy generates setup → compliance check → approval gate → executor places order). Continue extending the Research allowlist deliberately as real needs arise; consider real wiring for Instagram, Communications, Automation, and Documents verticals following the Research pattern (one real endpoint, explicit safety boundaries, audit log).</w:t>
+        <w:t xml:space="preserve">strategies to the registry (same pattern;</w:t>
+      </w:r>
+      <w:r>
+        <w:t xml:space="preserve"> </w:t>
+      </w:r>
+      <w:r>
+        <w:rPr>
+          <w:rStyle w:val="VerbatimChar"/>
+        </w:rPr>
+        <w:t xml:space="preserve">open_range</w:t>
+      </w:r>
+      <w:r>
+        <w:t xml:space="preserve"> </w:t>
+      </w:r>
+      <w:r>
+        <w:t xml:space="preserve">will require extending</w:t>
+      </w:r>
+      <w:r>
+        <w:t xml:space="preserve"> </w:t>
+      </w:r>
+      <w:r>
+        <w:rPr>
+          <w:rStyle w:val="VerbatimChar"/>
+        </w:rPr>
+        <w:t xml:space="preserve">MarketSnapshot</w:t>
+      </w:r>
+      <w:r>
+        <w:t xml:space="preserve"> </w:t>
+      </w:r>
+      <w:r>
+        <w:t xml:space="preserve">with opening-range high/low fields), then in a later gated PR wire strategy assignments + account compliance + the existing approval-gated MT5 executor to enable the full trade flow (strategy generates setup → compliance check → approval gate → executor places order). Continue extending the Research allowlist deliberately as real needs arise; consider real wiring for Instagram, Communications, Automation, and Documents verticals following the Research pattern (one real endpoint, explicit safety boundaries, audit log).</w:t>
       </w:r>
     </w:p>
     <w:p>

</xml_diff>